<commit_message>
Cartas timbradas: logo de la empresa en el membrete
- Tipo 'logo' en Configuración → Empresa (PNG/JPG).
- Membrete en las 3 cartas propias: logo + nombre·RNC + contacto + filete
  (plantillas regeneradas con generar-cartas-base.py; sin logo, la carta
  sale igual con el timbrado textual).
- Motor: logo escalado proporcional a sus dimensiones reales (parser
  PNG/JPEG, tope 190x60); /generar lo carga junto a firma y sello y la
  huella de idempotencia lo cubre; vista previa lo simula.
- Constructor: variable 'Logo de la empresa' arrastrable.
- Tests del membrete (proporción, sin-logo) + validación textutil.

Co-Authored-By: Claude Fable 5 <noreply@anthropic.com>
</commit_message>
<xml_diff>
--- a/plantillas/cartas/CARTA-COND-tpl.docx
+++ b/plantillas/cartas/CARTA-COND-tpl.docx
@@ -2,6 +2,49 @@
 <file path=word/document.xml><?xml version="1.0" encoding="utf-8"?>
 <w:document xmlns:w="http://schemas.openxmlformats.org/wordprocessingml/2006/main" xmlns:r="http://schemas.openxmlformats.org/officeDocument/2006/relationships" xmlns:wp="http://schemas.openxmlformats.org/drawingml/2006/wordprocessingDrawing" xmlns:a="http://schemas.openxmlformats.org/drawingml/2006/main" xmlns:pic="http://schemas.openxmlformats.org/drawingml/2006/picture">
   <w:body>
+    <w:p>
+      <w:pPr>
+        <w:jc w:val="center"/>
+        <w:spacing w:after="60"/>
+      </w:pPr>
+      <w:r>
+        <w:t xml:space="preserve">{%logo}</w:t>
+      </w:r>
+    </w:p>
+    <w:p>
+      <w:pPr>
+        <w:jc w:val="center"/>
+        <w:spacing w:after="40"/>
+      </w:pPr>
+      <w:r>
+        <w:rPr>
+          <w:sz w:val="18"/>
+          <w:color w:val="595959"/>
+        </w:rPr>
+        <w:t xml:space="preserve">{empresa_nombre} · RNC {rnc}</w:t>
+      </w:r>
+    </w:p>
+    <w:p>
+      <w:pPr>
+        <w:jc w:val="center"/>
+        <w:spacing w:after="40"/>
+      </w:pPr>
+      <w:r>
+        <w:rPr>
+          <w:sz w:val="16"/>
+          <w:color w:val="595959"/>
+        </w:rPr>
+        <w:t xml:space="preserve">{empresa_direccion} · Tel. {empresa_telefono} · {empresa_email}</w:t>
+      </w:r>
+    </w:p>
+    <w:p>
+      <w:pPr>
+        <w:pBdr>
+          <w:bottom w:val="single" w:sz="6" w:space="1" w:color="595959"/>
+        </w:pBdr>
+        <w:spacing w:after="300"/>
+      </w:pPr>
+    </w:p>
     <w:p>
       <w:pPr>
         <w:jc w:val="right"/>

</xml_diff>